<commit_message>
Entry #048: generator v9.2 (--think); bake-off results (12 runs) and ADR-047 §14 workload assignment; qwen3.5:9b removed; Docker reset + restore recorded; findings F14, F15
Co-Authored-By: Claude Opus 5.5 <noreply@anthropic.com>
</commit_message>
<xml_diff>
--- a/ADR_047.docx
+++ b/ADR_047.docx
@@ -183,7 +183,7 @@
                 <w:rFonts w:ascii="Calibri" w:hAnsi="Calibri" w:cs="Calibri"/>
                 <w:sz w:val="20"/>
               </w:rPr>
-              <w:t xml:space="preserve">DECIDED — September 29, 2026; §8 amended the same day (pressure level 2). Drafted and proposed the same day (Entry #048); operator decisions on the three open questions recorded in Section 12. Implementation proceeds step by step under Section 10, each step approved.</w:t>
+              <w:t xml:space="preserve">DECIDED — September 29, 2026; §8 amended the same day (pressure level 2); §14 added the same day (bake-off results; workload assignment). Drafted and proposed the same day (Entry #048); operator decisions on the three open questions recorded in Section 12. Implementation proceeds step by step under Section 10, each step approved.</w:t>
             </w:r>
           </w:p>
         </w:tc>
@@ -1694,6 +1694,13 @@
           <w:sz w:val="21"/>
         </w:rPr>
         <w:t xml:space="preserve">One local model.</w:t>
+      </w:r>
+      <w:r>
+        <w:rPr>
+          <w:rFonts w:ascii="Calibri" w:hAnsi="Calibri" w:cs="Calibri"/>
+          <w:sz w:val="21"/>
+        </w:rPr>
+        <w:t xml:space="preserve">(Superseded by Section 14, September 29, 2026: two models, one resident at a time.)</w:t>
       </w:r>
       <w:r>
         <w:rPr>
@@ -4335,6 +4342,1053 @@
     </w:p>
     <w:p>
       <w:pPr>
+        <w:spacing w:before="240" w:after="80"/>
+      </w:pPr>
+      <w:r>
+        <w:rPr>
+          <w:rFonts w:ascii="Calibri" w:hAnsi="Calibri" w:cs="Calibri"/>
+          <w:b/>
+          <w:sz w:val="26"/>
+        </w:rPr>
+        <w:t xml:space="preserve">14. Amendment — Bake-off Results and Workload Assignment (September 29, 2026)</w:t>
+      </w:r>
+    </w:p>
+    <w:p>
+      <w:pPr>
+        <w:spacing w:before="0" w:after="100"/>
+      </w:pPr>
+      <w:r>
+        <w:rPr>
+          <w:rFonts w:ascii="Calibri" w:hAnsi="Calibri" w:cs="Calibri"/>
+          <w:sz w:val="21"/>
+        </w:rPr>
+        <w:t xml:space="preserve">Twelve review-only runs, 2026-09-29 14:31–15:28, all exit 0: four configurations × three rounds, round-robin, one 14-day window of 27 documents, scratch copy (no send, no is_new change, no tracked file). Memory sampled every 10 seconds.</w:t>
+      </w:r>
+    </w:p>
+    <w:tbl>
+      <w:tblPr>
+        <w:tblW w:w="10080" w:type="dxa"/>
+        <w:tblBorders>
+          <w:top w:val="single" w:sz="4" w:space="0" w:color="999999"/>
+          <w:left w:val="single" w:sz="4" w:space="0" w:color="999999"/>
+          <w:bottom w:val="single" w:sz="4" w:space="0" w:color="999999"/>
+          <w:right w:val="single" w:sz="4" w:space="0" w:color="999999"/>
+          <w:insideH w:val="single" w:sz="4" w:space="0" w:color="999999"/>
+          <w:insideV w:val="single" w:sz="4" w:space="0" w:color="999999"/>
+        </w:tblBorders>
+        <w:tblCellMar>
+          <w:left w:w="80" w:type="dxa"/>
+          <w:right w:w="80" w:type="dxa"/>
+        </w:tblCellMar>
+      </w:tblPr>
+      <w:tblGrid>
+        <w:gridCol w:w="1440"/>
+        <w:gridCol w:w="1440"/>
+        <w:gridCol w:w="1440"/>
+        <w:gridCol w:w="1440"/>
+        <w:gridCol w:w="1440"/>
+        <w:gridCol w:w="1440"/>
+        <w:gridCol w:w="1440"/>
+      </w:tblGrid>
+      <w:tr>
+        <w:tc>
+          <w:tcPr>
+            <w:tcW w:w="1440" w:type="dxa"/>
+            <w:shd w:val="clear" w:color="auto" w:fill="F2F2F2"/>
+          </w:tcPr>
+          <w:p>
+            <w:pPr>
+              <w:spacing w:before="0" w:after="0"/>
+            </w:pPr>
+            <w:r>
+              <w:rPr>
+                <w:rFonts w:ascii="Calibri" w:hAnsi="Calibri" w:cs="Calibri"/>
+                <w:b/>
+                <w:sz w:val="20"/>
+              </w:rPr>
+              <w:t xml:space="preserve">Configuration</w:t>
+            </w:r>
+          </w:p>
+        </w:tc>
+        <w:tc>
+          <w:tcPr>
+            <w:tcW w:w="1440" w:type="dxa"/>
+            <w:shd w:val="clear" w:color="auto" w:fill="F2F2F2"/>
+          </w:tcPr>
+          <w:p>
+            <w:pPr>
+              <w:spacing w:before="0" w:after="0"/>
+            </w:pPr>
+            <w:r>
+              <w:rPr>
+                <w:rFonts w:ascii="Calibri" w:hAnsi="Calibri" w:cs="Calibri"/>
+                <w:b/>
+                <w:sz w:val="20"/>
+              </w:rPr>
+              <w:t xml:space="preserve">Fabrications</w:t>
+            </w:r>
+          </w:p>
+        </w:tc>
+        <w:tc>
+          <w:tcPr>
+            <w:tcW w:w="1440" w:type="dxa"/>
+            <w:shd w:val="clear" w:color="auto" w:fill="F2F2F2"/>
+          </w:tcPr>
+          <w:p>
+            <w:pPr>
+              <w:spacing w:before="0" w:after="0"/>
+            </w:pPr>
+            <w:r>
+              <w:rPr>
+                <w:rFonts w:ascii="Calibri" w:hAnsi="Calibri" w:cs="Calibri"/>
+                <w:b/>
+                <w:sz w:val="20"/>
+              </w:rPr>
+              <w:t xml:space="preserve">Verifier warnings</w:t>
+            </w:r>
+          </w:p>
+        </w:tc>
+        <w:tc>
+          <w:tcPr>
+            <w:tcW w:w="1440" w:type="dxa"/>
+            <w:shd w:val="clear" w:color="auto" w:fill="F2F2F2"/>
+          </w:tcPr>
+          <w:p>
+            <w:pPr>
+              <w:spacing w:before="0" w:after="0"/>
+            </w:pPr>
+            <w:r>
+              <w:rPr>
+                <w:rFonts w:ascii="Calibri" w:hAnsi="Calibri" w:cs="Calibri"/>
+                <w:b/>
+                <w:sz w:val="20"/>
+              </w:rPr>
+              <w:t xml:space="preserve">Truncations</w:t>
+            </w:r>
+          </w:p>
+        </w:tc>
+        <w:tc>
+          <w:tcPr>
+            <w:tcW w:w="1440" w:type="dxa"/>
+            <w:shd w:val="clear" w:color="auto" w:fill="F2F2F2"/>
+          </w:tcPr>
+          <w:p>
+            <w:pPr>
+              <w:spacing w:before="0" w:after="0"/>
+            </w:pPr>
+            <w:r>
+              <w:rPr>
+                <w:rFonts w:ascii="Calibri" w:hAnsi="Calibri" w:cs="Calibri"/>
+                <w:b/>
+                <w:sz w:val="20"/>
+              </w:rPr>
+              <w:t xml:space="preserve">Median time</w:t>
+            </w:r>
+          </w:p>
+        </w:tc>
+        <w:tc>
+          <w:tcPr>
+            <w:tcW w:w="1440" w:type="dxa"/>
+            <w:shd w:val="clear" w:color="auto" w:fill="F2F2F2"/>
+          </w:tcPr>
+          <w:p>
+            <w:pPr>
+              <w:spacing w:before="0" w:after="0"/>
+            </w:pPr>
+            <w:r>
+              <w:rPr>
+                <w:rFonts w:ascii="Calibri" w:hAnsi="Calibri" w:cs="Calibri"/>
+                <w:b/>
+                <w:sz w:val="20"/>
+              </w:rPr>
+              <w:t xml:space="preserve">Median memory drop*</w:t>
+            </w:r>
+          </w:p>
+        </w:tc>
+        <w:tc>
+          <w:tcPr>
+            <w:tcW w:w="1440" w:type="dxa"/>
+            <w:shd w:val="clear" w:color="auto" w:fill="F2F2F2"/>
+          </w:tcPr>
+          <w:p>
+            <w:pPr>
+              <w:spacing w:before="0" w:after="0"/>
+            </w:pPr>
+            <w:r>
+              <w:rPr>
+                <w:rFonts w:ascii="Calibri" w:hAnsi="Calibri" w:cs="Calibri"/>
+                <w:b/>
+                <w:sz w:val="20"/>
+              </w:rPr>
+              <w:t xml:space="preserve">Time at pressure ≥ 2*</w:t>
+            </w:r>
+          </w:p>
+        </w:tc>
+      </w:tr>
+      <w:tr>
+        <w:tc>
+          <w:tcPr>
+            <w:tcW w:w="1440" w:type="dxa"/>
+          </w:tcPr>
+          <w:p>
+            <w:pPr>
+              <w:spacing w:before="0" w:after="0"/>
+            </w:pPr>
+            <w:r>
+              <w:rPr>
+                <w:rFonts w:ascii="Calibri" w:hAnsi="Calibri" w:cs="Calibri"/>
+                <w:sz w:val="20"/>
+              </w:rPr>
+              <w:t xml:space="preserve">gemma4:e4b, thinking on (production before this ADR)</w:t>
+            </w:r>
+          </w:p>
+        </w:tc>
+        <w:tc>
+          <w:tcPr>
+            <w:tcW w:w="1440" w:type="dxa"/>
+          </w:tcPr>
+          <w:p>
+            <w:pPr>
+              <w:spacing w:before="0" w:after="0"/>
+            </w:pPr>
+            <w:r>
+              <w:rPr>
+                <w:rFonts w:ascii="Calibri" w:hAnsi="Calibri" w:cs="Calibri"/>
+                <w:sz w:val="20"/>
+              </w:rPr>
+              <w:t xml:space="preserve">0</w:t>
+            </w:r>
+          </w:p>
+        </w:tc>
+        <w:tc>
+          <w:tcPr>
+            <w:tcW w:w="1440" w:type="dxa"/>
+          </w:tcPr>
+          <w:p>
+            <w:pPr>
+              <w:spacing w:before="0" w:after="0"/>
+            </w:pPr>
+            <w:r>
+              <w:rPr>
+                <w:rFonts w:ascii="Calibri" w:hAnsi="Calibri" w:cs="Calibri"/>
+                <w:sz w:val="20"/>
+              </w:rPr>
+              <w:t xml:space="preserve">0</w:t>
+            </w:r>
+          </w:p>
+        </w:tc>
+        <w:tc>
+          <w:tcPr>
+            <w:tcW w:w="1440" w:type="dxa"/>
+          </w:tcPr>
+          <w:p>
+            <w:pPr>
+              <w:spacing w:before="0" w:after="0"/>
+            </w:pPr>
+            <w:r>
+              <w:rPr>
+                <w:rFonts w:ascii="Calibri" w:hAnsi="Calibri" w:cs="Calibri"/>
+                <w:sz w:val="20"/>
+              </w:rPr>
+              <w:t xml:space="preserve">0</w:t>
+            </w:r>
+          </w:p>
+        </w:tc>
+        <w:tc>
+          <w:tcPr>
+            <w:tcW w:w="1440" w:type="dxa"/>
+          </w:tcPr>
+          <w:p>
+            <w:pPr>
+              <w:spacing w:before="0" w:after="0"/>
+            </w:pPr>
+            <w:r>
+              <w:rPr>
+                <w:rFonts w:ascii="Calibri" w:hAnsi="Calibri" w:cs="Calibri"/>
+                <w:sz w:val="20"/>
+              </w:rPr>
+              <w:t xml:space="preserve">429 s</w:t>
+            </w:r>
+          </w:p>
+        </w:tc>
+        <w:tc>
+          <w:tcPr>
+            <w:tcW w:w="1440" w:type="dxa"/>
+          </w:tcPr>
+          <w:p>
+            <w:pPr>
+              <w:spacing w:before="0" w:after="0"/>
+            </w:pPr>
+            <w:r>
+              <w:rPr>
+                <w:rFonts w:ascii="Calibri" w:hAnsi="Calibri" w:cs="Calibri"/>
+                <w:sz w:val="20"/>
+              </w:rPr>
+              <w:t xml:space="preserve">~9.4 GB</w:t>
+            </w:r>
+          </w:p>
+        </w:tc>
+        <w:tc>
+          <w:tcPr>
+            <w:tcW w:w="1440" w:type="dxa"/>
+          </w:tcPr>
+          <w:p>
+            <w:pPr>
+              <w:spacing w:before="0" w:after="0"/>
+            </w:pPr>
+            <w:r>
+              <w:rPr>
+                <w:rFonts w:ascii="Calibri" w:hAnsi="Calibri" w:cs="Calibri"/>
+                <w:sz w:val="20"/>
+              </w:rPr>
+              <w:t xml:space="preserve">95%</w:t>
+            </w:r>
+          </w:p>
+        </w:tc>
+      </w:tr>
+      <w:tr>
+        <w:tc>
+          <w:tcPr>
+            <w:tcW w:w="1440" w:type="dxa"/>
+          </w:tcPr>
+          <w:p>
+            <w:pPr>
+              <w:spacing w:before="0" w:after="0"/>
+            </w:pPr>
+            <w:r>
+              <w:rPr>
+                <w:rFonts w:ascii="Calibri" w:hAnsi="Calibri" w:cs="Calibri"/>
+                <w:sz w:val="20"/>
+              </w:rPr>
+              <w:t xml:space="preserve">gemma4:e4b, thinking off</w:t>
+            </w:r>
+          </w:p>
+        </w:tc>
+        <w:tc>
+          <w:tcPr>
+            <w:tcW w:w="1440" w:type="dxa"/>
+          </w:tcPr>
+          <w:p>
+            <w:pPr>
+              <w:spacing w:before="0" w:after="0"/>
+            </w:pPr>
+            <w:r>
+              <w:rPr>
+                <w:rFonts w:ascii="Calibri" w:hAnsi="Calibri" w:cs="Calibri"/>
+                <w:sz w:val="20"/>
+              </w:rPr>
+              <w:t xml:space="preserve">0</w:t>
+            </w:r>
+          </w:p>
+        </w:tc>
+        <w:tc>
+          <w:tcPr>
+            <w:tcW w:w="1440" w:type="dxa"/>
+          </w:tcPr>
+          <w:p>
+            <w:pPr>
+              <w:spacing w:before="0" w:after="0"/>
+            </w:pPr>
+            <w:r>
+              <w:rPr>
+                <w:rFonts w:ascii="Calibri" w:hAnsi="Calibri" w:cs="Calibri"/>
+                <w:sz w:val="20"/>
+              </w:rPr>
+              <w:t xml:space="preserve">0</w:t>
+            </w:r>
+          </w:p>
+        </w:tc>
+        <w:tc>
+          <w:tcPr>
+            <w:tcW w:w="1440" w:type="dxa"/>
+          </w:tcPr>
+          <w:p>
+            <w:pPr>
+              <w:spacing w:before="0" w:after="0"/>
+            </w:pPr>
+            <w:r>
+              <w:rPr>
+                <w:rFonts w:ascii="Calibri" w:hAnsi="Calibri" w:cs="Calibri"/>
+                <w:sz w:val="20"/>
+              </w:rPr>
+              <w:t xml:space="preserve">0</w:t>
+            </w:r>
+          </w:p>
+        </w:tc>
+        <w:tc>
+          <w:tcPr>
+            <w:tcW w:w="1440" w:type="dxa"/>
+          </w:tcPr>
+          <w:p>
+            <w:pPr>
+              <w:spacing w:before="0" w:after="0"/>
+            </w:pPr>
+            <w:r>
+              <w:rPr>
+                <w:rFonts w:ascii="Calibri" w:hAnsi="Calibri" w:cs="Calibri"/>
+                <w:sz w:val="20"/>
+              </w:rPr>
+              <w:t xml:space="preserve">154 s</w:t>
+            </w:r>
+          </w:p>
+        </w:tc>
+        <w:tc>
+          <w:tcPr>
+            <w:tcW w:w="1440" w:type="dxa"/>
+          </w:tcPr>
+          <w:p>
+            <w:pPr>
+              <w:spacing w:before="0" w:after="0"/>
+            </w:pPr>
+            <w:r>
+              <w:rPr>
+                <w:rFonts w:ascii="Calibri" w:hAnsi="Calibri" w:cs="Calibri"/>
+                <w:sz w:val="20"/>
+              </w:rPr>
+              <w:t xml:space="preserve">~5.8 GB</w:t>
+            </w:r>
+          </w:p>
+        </w:tc>
+        <w:tc>
+          <w:tcPr>
+            <w:tcW w:w="1440" w:type="dxa"/>
+          </w:tcPr>
+          <w:p>
+            <w:pPr>
+              <w:spacing w:before="0" w:after="0"/>
+            </w:pPr>
+            <w:r>
+              <w:rPr>
+                <w:rFonts w:ascii="Calibri" w:hAnsi="Calibri" w:cs="Calibri"/>
+                <w:sz w:val="20"/>
+              </w:rPr>
+              <w:t xml:space="preserve">81%</w:t>
+            </w:r>
+          </w:p>
+        </w:tc>
+      </w:tr>
+      <w:tr>
+        <w:tc>
+          <w:tcPr>
+            <w:tcW w:w="1440" w:type="dxa"/>
+          </w:tcPr>
+          <w:p>
+            <w:pPr>
+              <w:spacing w:before="0" w:after="0"/>
+            </w:pPr>
+            <w:r>
+              <w:rPr>
+                <w:rFonts w:ascii="Calibri" w:hAnsi="Calibri" w:cs="Calibri"/>
+                <w:sz w:val="20"/>
+              </w:rPr>
+              <w:t xml:space="preserve">qwen3:8b, thinking off</w:t>
+            </w:r>
+          </w:p>
+        </w:tc>
+        <w:tc>
+          <w:tcPr>
+            <w:tcW w:w="1440" w:type="dxa"/>
+          </w:tcPr>
+          <w:p>
+            <w:pPr>
+              <w:spacing w:before="0" w:after="0"/>
+            </w:pPr>
+            <w:r>
+              <w:rPr>
+                <w:rFonts w:ascii="Calibri" w:hAnsi="Calibri" w:cs="Calibri"/>
+                <w:sz w:val="20"/>
+              </w:rPr>
+              <w:t xml:space="preserve">0</w:t>
+            </w:r>
+          </w:p>
+        </w:tc>
+        <w:tc>
+          <w:tcPr>
+            <w:tcW w:w="1440" w:type="dxa"/>
+          </w:tcPr>
+          <w:p>
+            <w:pPr>
+              <w:spacing w:before="0" w:after="0"/>
+            </w:pPr>
+            <w:r>
+              <w:rPr>
+                <w:rFonts w:ascii="Calibri" w:hAnsi="Calibri" w:cs="Calibri"/>
+                <w:sz w:val="20"/>
+              </w:rPr>
+              <w:t xml:space="preserve">0</w:t>
+            </w:r>
+          </w:p>
+        </w:tc>
+        <w:tc>
+          <w:tcPr>
+            <w:tcW w:w="1440" w:type="dxa"/>
+          </w:tcPr>
+          <w:p>
+            <w:pPr>
+              <w:spacing w:before="0" w:after="0"/>
+            </w:pPr>
+            <w:r>
+              <w:rPr>
+                <w:rFonts w:ascii="Calibri" w:hAnsi="Calibri" w:cs="Calibri"/>
+                <w:sz w:val="20"/>
+              </w:rPr>
+              <w:t xml:space="preserve">0</w:t>
+            </w:r>
+          </w:p>
+        </w:tc>
+        <w:tc>
+          <w:tcPr>
+            <w:tcW w:w="1440" w:type="dxa"/>
+          </w:tcPr>
+          <w:p>
+            <w:pPr>
+              <w:spacing w:before="0" w:after="0"/>
+            </w:pPr>
+            <w:r>
+              <w:rPr>
+                <w:rFonts w:ascii="Calibri" w:hAnsi="Calibri" w:cs="Calibri"/>
+                <w:sz w:val="20"/>
+              </w:rPr>
+              <w:t xml:space="preserve">224 s</w:t>
+            </w:r>
+          </w:p>
+        </w:tc>
+        <w:tc>
+          <w:tcPr>
+            <w:tcW w:w="1440" w:type="dxa"/>
+          </w:tcPr>
+          <w:p>
+            <w:pPr>
+              <w:spacing w:before="0" w:after="0"/>
+            </w:pPr>
+            <w:r>
+              <w:rPr>
+                <w:rFonts w:ascii="Calibri" w:hAnsi="Calibri" w:cs="Calibri"/>
+                <w:sz w:val="20"/>
+              </w:rPr>
+              <w:t xml:space="preserve">~3.4 GB</w:t>
+            </w:r>
+          </w:p>
+        </w:tc>
+        <w:tc>
+          <w:tcPr>
+            <w:tcW w:w="1440" w:type="dxa"/>
+          </w:tcPr>
+          <w:p>
+            <w:pPr>
+              <w:spacing w:before="0" w:after="0"/>
+            </w:pPr>
+            <w:r>
+              <w:rPr>
+                <w:rFonts w:ascii="Calibri" w:hAnsi="Calibri" w:cs="Calibri"/>
+                <w:sz w:val="20"/>
+              </w:rPr>
+              <w:t xml:space="preserve">0%</w:t>
+            </w:r>
+          </w:p>
+        </w:tc>
+      </w:tr>
+      <w:tr>
+        <w:tc>
+          <w:tcPr>
+            <w:tcW w:w="1440" w:type="dxa"/>
+          </w:tcPr>
+          <w:p>
+            <w:pPr>
+              <w:spacing w:before="0" w:after="0"/>
+            </w:pPr>
+            <w:r>
+              <w:rPr>
+                <w:rFonts w:ascii="Calibri" w:hAnsi="Calibri" w:cs="Calibri"/>
+                <w:sz w:val="20"/>
+              </w:rPr>
+              <w:t xml:space="preserve">qwen3.5:9b, thinking off</w:t>
+            </w:r>
+          </w:p>
+        </w:tc>
+        <w:tc>
+          <w:tcPr>
+            <w:tcW w:w="1440" w:type="dxa"/>
+          </w:tcPr>
+          <w:p>
+            <w:pPr>
+              <w:spacing w:before="0" w:after="0"/>
+            </w:pPr>
+            <w:r>
+              <w:rPr>
+                <w:rFonts w:ascii="Calibri" w:hAnsi="Calibri" w:cs="Calibri"/>
+                <w:sz w:val="20"/>
+              </w:rPr>
+              <w:t xml:space="preserve">0</w:t>
+            </w:r>
+          </w:p>
+        </w:tc>
+        <w:tc>
+          <w:tcPr>
+            <w:tcW w:w="1440" w:type="dxa"/>
+          </w:tcPr>
+          <w:p>
+            <w:pPr>
+              <w:spacing w:before="0" w:after="0"/>
+            </w:pPr>
+            <w:r>
+              <w:rPr>
+                <w:rFonts w:ascii="Calibri" w:hAnsi="Calibri" w:cs="Calibri"/>
+                <w:sz w:val="20"/>
+              </w:rPr>
+              <w:t xml:space="preserve">5 (all correct subset counts — F13 shape)</w:t>
+            </w:r>
+          </w:p>
+        </w:tc>
+        <w:tc>
+          <w:tcPr>
+            <w:tcW w:w="1440" w:type="dxa"/>
+          </w:tcPr>
+          <w:p>
+            <w:pPr>
+              <w:spacing w:before="0" w:after="0"/>
+            </w:pPr>
+            <w:r>
+              <w:rPr>
+                <w:rFonts w:ascii="Calibri" w:hAnsi="Calibri" w:cs="Calibri"/>
+                <w:sz w:val="20"/>
+              </w:rPr>
+              <w:t xml:space="preserve">0</w:t>
+            </w:r>
+          </w:p>
+        </w:tc>
+        <w:tc>
+          <w:tcPr>
+            <w:tcW w:w="1440" w:type="dxa"/>
+          </w:tcPr>
+          <w:p>
+            <w:pPr>
+              <w:spacing w:before="0" w:after="0"/>
+            </w:pPr>
+            <w:r>
+              <w:rPr>
+                <w:rFonts w:ascii="Calibri" w:hAnsi="Calibri" w:cs="Calibri"/>
+                <w:sz w:val="20"/>
+              </w:rPr>
+              <w:t xml:space="preserve">287 s</w:t>
+            </w:r>
+          </w:p>
+        </w:tc>
+        <w:tc>
+          <w:tcPr>
+            <w:tcW w:w="1440" w:type="dxa"/>
+          </w:tcPr>
+          <w:p>
+            <w:pPr>
+              <w:spacing w:before="0" w:after="0"/>
+            </w:pPr>
+            <w:r>
+              <w:rPr>
+                <w:rFonts w:ascii="Calibri" w:hAnsi="Calibri" w:cs="Calibri"/>
+                <w:sz w:val="20"/>
+              </w:rPr>
+              <w:t xml:space="preserve">~7.7 GB</w:t>
+            </w:r>
+          </w:p>
+        </w:tc>
+        <w:tc>
+          <w:tcPr>
+            <w:tcW w:w="1440" w:type="dxa"/>
+          </w:tcPr>
+          <w:p>
+            <w:pPr>
+              <w:spacing w:before="0" w:after="0"/>
+            </w:pPr>
+            <w:r>
+              <w:rPr>
+                <w:rFonts w:ascii="Calibri" w:hAnsi="Calibri" w:cs="Calibri"/>
+                <w:sz w:val="20"/>
+              </w:rPr>
+              <w:t xml:space="preserve">25%</w:t>
+            </w:r>
+          </w:p>
+        </w:tc>
+      </w:tr>
+    </w:tbl>
+    <w:p/>
+    <w:p>
+      <w:pPr>
+        <w:spacing w:before="0" w:after="100"/>
+      </w:pPr>
+      <w:r>
+        <w:rPr>
+          <w:rFonts w:ascii="Calibri" w:hAnsi="Calibri" w:cs="Calibri"/>
+          <w:sz w:val="21"/>
+        </w:rPr>
+        <w:t xml:space="preserve">*Indicative only: the same configuration varied widely between rounds. Every warning was classified by hand; none was a fabrication. On this window the verifier could not separate the models on accuracy, and the 15-vs-18 state-count shape was not provoked.</w:t>
+      </w:r>
+    </w:p>
+    <w:p>
+      <w:pPr>
+        <w:spacing w:before="0" w:after="100"/>
+      </w:pPr>
+      <w:r>
+        <w:rPr>
+          <w:rFonts w:ascii="Calibri" w:hAnsi="Calibri" w:cs="Calibri"/>
+          <w:b/>
+          <w:sz w:val="21"/>
+        </w:rPr>
+        <w:t xml:space="preserve">Findings.</w:t>
+      </w:r>
+      <w:r>
+        <w:rPr>
+          <w:rFonts w:ascii="Calibri" w:hAnsi="Calibri" w:cs="Calibri"/>
+          <w:sz w:val="21"/>
+        </w:rPr>
+        <w:t xml:space="preserve"> Thinking costs time and memory, not accuracy, on this workload: gemma4 was 2.8× faster with thinking off and identical verifier results. gemma4:e4b reasons by default (finding F14), so every brief before this ADR spent time and context on hidden reasoning. qwen3.5:9b was removed: slowest and most variable of the thinking-off configurations, and its correct subset counts would have held correct briefs from --send in two of three runs.</w:t>
+      </w:r>
+    </w:p>
+    <w:p>
+      <w:pPr>
+        <w:spacing w:before="0" w:after="100"/>
+      </w:pPr>
+      <w:r>
+        <w:rPr>
+          <w:rFonts w:ascii="Calibri" w:hAnsi="Calibri" w:cs="Calibri"/>
+          <w:b/>
+          <w:sz w:val="21"/>
+        </w:rPr>
+        <w:t xml:space="preserve">Decision (operator, September 29, 2026).</w:t>
+      </w:r>
+      <w:r>
+        <w:rPr>
+          <w:rFonts w:ascii="Calibri" w:hAnsi="Calibri" w:cs="Calibri"/>
+          <w:sz w:val="21"/>
+        </w:rPr>
+        <w:t xml:space="preserve"> Section 3's single-model rule is superseded. Two local models are kept, each assigned to a workload. Only one is resident at a time (OLLAMA_MAX_LOADED_MODELS=1 and the Section 6 lock), and the brief releases its model on finish, so switching adds no cost beyond the cold load every job already pays.</w:t>
+      </w:r>
+    </w:p>
+    <w:tbl>
+      <w:tblPr>
+        <w:tblW w:w="10080" w:type="dxa"/>
+        <w:tblBorders>
+          <w:top w:val="single" w:sz="4" w:space="0" w:color="999999"/>
+          <w:left w:val="single" w:sz="4" w:space="0" w:color="999999"/>
+          <w:bottom w:val="single" w:sz="4" w:space="0" w:color="999999"/>
+          <w:right w:val="single" w:sz="4" w:space="0" w:color="999999"/>
+          <w:insideH w:val="single" w:sz="4" w:space="0" w:color="999999"/>
+          <w:insideV w:val="single" w:sz="4" w:space="0" w:color="999999"/>
+        </w:tblBorders>
+        <w:tblCellMar>
+          <w:left w:w="80" w:type="dxa"/>
+          <w:right w:w="80" w:type="dxa"/>
+        </w:tblCellMar>
+      </w:tblPr>
+      <w:tblGrid>
+        <w:gridCol w:w="2520"/>
+        <w:gridCol w:w="2520"/>
+        <w:gridCol w:w="2520"/>
+        <w:gridCol w:w="2520"/>
+      </w:tblGrid>
+      <w:tr>
+        <w:tc>
+          <w:tcPr>
+            <w:tcW w:w="2520" w:type="dxa"/>
+            <w:shd w:val="clear" w:color="auto" w:fill="F2F2F2"/>
+          </w:tcPr>
+          <w:p>
+            <w:pPr>
+              <w:spacing w:before="0" w:after="0"/>
+            </w:pPr>
+            <w:r>
+              <w:rPr>
+                <w:rFonts w:ascii="Calibri" w:hAnsi="Calibri" w:cs="Calibri"/>
+                <w:b/>
+                <w:sz w:val="20"/>
+              </w:rPr>
+              <w:t xml:space="preserve">Workload</w:t>
+            </w:r>
+          </w:p>
+        </w:tc>
+        <w:tc>
+          <w:tcPr>
+            <w:tcW w:w="2520" w:type="dxa"/>
+            <w:shd w:val="clear" w:color="auto" w:fill="F2F2F2"/>
+          </w:tcPr>
+          <w:p>
+            <w:pPr>
+              <w:spacing w:before="0" w:after="0"/>
+            </w:pPr>
+            <w:r>
+              <w:rPr>
+                <w:rFonts w:ascii="Calibri" w:hAnsi="Calibri" w:cs="Calibri"/>
+                <w:b/>
+                <w:sz w:val="20"/>
+              </w:rPr>
+              <w:t xml:space="preserve">Model</w:t>
+            </w:r>
+          </w:p>
+        </w:tc>
+        <w:tc>
+          <w:tcPr>
+            <w:tcW w:w="2520" w:type="dxa"/>
+            <w:shd w:val="clear" w:color="auto" w:fill="F2F2F2"/>
+          </w:tcPr>
+          <w:p>
+            <w:pPr>
+              <w:spacing w:before="0" w:after="0"/>
+            </w:pPr>
+            <w:r>
+              <w:rPr>
+                <w:rFonts w:ascii="Calibri" w:hAnsi="Calibri" w:cs="Calibri"/>
+                <w:b/>
+                <w:sz w:val="20"/>
+              </w:rPr>
+              <w:t xml:space="preserve">Thinking</w:t>
+            </w:r>
+          </w:p>
+        </w:tc>
+        <w:tc>
+          <w:tcPr>
+            <w:tcW w:w="2520" w:type="dxa"/>
+            <w:shd w:val="clear" w:color="auto" w:fill="F2F2F2"/>
+          </w:tcPr>
+          <w:p>
+            <w:pPr>
+              <w:spacing w:before="0" w:after="0"/>
+            </w:pPr>
+            <w:r>
+              <w:rPr>
+                <w:rFonts w:ascii="Calibri" w:hAnsi="Calibri" w:cs="Calibri"/>
+                <w:b/>
+                <w:sz w:val="20"/>
+              </w:rPr>
+              <w:t xml:space="preserve">Basis</w:t>
+            </w:r>
+          </w:p>
+        </w:tc>
+      </w:tr>
+      <w:tr>
+        <w:tc>
+          <w:tcPr>
+            <w:tcW w:w="2520" w:type="dxa"/>
+          </w:tcPr>
+          <w:p>
+            <w:pPr>
+              <w:spacing w:before="0" w:after="0"/>
+            </w:pPr>
+            <w:r>
+              <w:rPr>
+                <w:rFonts w:ascii="Calibri" w:hAnsi="Calibri" w:cs="Calibri"/>
+                <w:sz w:val="20"/>
+              </w:rPr>
+              <w:t xml:space="preserve">Policy briefs (federal_policy_brief; future Medicaid / SNAP / TANF scrape-and-summarise projects)</w:t>
+            </w:r>
+          </w:p>
+        </w:tc>
+        <w:tc>
+          <w:tcPr>
+            <w:tcW w:w="2520" w:type="dxa"/>
+          </w:tcPr>
+          <w:p>
+            <w:pPr>
+              <w:spacing w:before="0" w:after="0"/>
+            </w:pPr>
+            <w:r>
+              <w:rPr>
+                <w:rFonts w:ascii="Calibri" w:hAnsi="Calibri" w:cs="Calibri"/>
+                <w:sz w:val="20"/>
+              </w:rPr>
+              <w:t xml:space="preserve">qwen3:8b — operator's leading choice on output quality; takes effect with the per-workload configuration change. gemma4:e4b remains in place until then.</w:t>
+            </w:r>
+          </w:p>
+        </w:tc>
+        <w:tc>
+          <w:tcPr>
+            <w:tcW w:w="2520" w:type="dxa"/>
+          </w:tcPr>
+          <w:p>
+            <w:pPr>
+              <w:spacing w:before="0" w:after="0"/>
+            </w:pPr>
+            <w:r>
+              <w:rPr>
+                <w:rFonts w:ascii="Calibri" w:hAnsi="Calibri" w:cs="Calibri"/>
+                <w:sz w:val="20"/>
+              </w:rPr>
+              <w:t xml:space="preserve">Off</w:t>
+            </w:r>
+          </w:p>
+        </w:tc>
+        <w:tc>
+          <w:tcPr>
+            <w:tcW w:w="2520" w:type="dxa"/>
+          </w:tcPr>
+          <w:p>
+            <w:pPr>
+              <w:spacing w:before="0" w:after="0"/>
+            </w:pPr>
+            <w:r>
+              <w:rPr>
+                <w:rFonts w:ascii="Calibri" w:hAnsi="Calibri" w:cs="Calibri"/>
+                <w:sz w:val="20"/>
+              </w:rPr>
+              <w:t xml:space="preserve">Lightest in memory; zero fabrications; operator leaning toward its output (not yet final).</w:t>
+            </w:r>
+          </w:p>
+        </w:tc>
+      </w:tr>
+      <w:tr>
+        <w:tc>
+          <w:tcPr>
+            <w:tcW w:w="2520" w:type="dxa"/>
+          </w:tcPr>
+          <w:p>
+            <w:pPr>
+              <w:spacing w:before="0" w:after="0"/>
+            </w:pPr>
+            <w:r>
+              <w:rPr>
+                <w:rFonts w:ascii="Calibri" w:hAnsi="Calibri" w:cs="Calibri"/>
+                <w:sz w:val="20"/>
+              </w:rPr>
+              <w:t xml:space="preserve">Chat (/agent, Telegram)</w:t>
+            </w:r>
+          </w:p>
+        </w:tc>
+        <w:tc>
+          <w:tcPr>
+            <w:tcW w:w="2520" w:type="dxa"/>
+          </w:tcPr>
+          <w:p>
+            <w:pPr>
+              <w:spacing w:before="0" w:after="0"/>
+            </w:pPr>
+            <w:r>
+              <w:rPr>
+                <w:rFonts w:ascii="Calibri" w:hAnsi="Calibri" w:cs="Calibri"/>
+                <w:sz w:val="20"/>
+              </w:rPr>
+              <w:t xml:space="preserve">gemma4:e4b</w:t>
+            </w:r>
+          </w:p>
+        </w:tc>
+        <w:tc>
+          <w:tcPr>
+            <w:tcW w:w="2520" w:type="dxa"/>
+          </w:tcPr>
+          <w:p>
+            <w:pPr>
+              <w:spacing w:before="0" w:after="0"/>
+            </w:pPr>
+            <w:r>
+              <w:rPr>
+                <w:rFonts w:ascii="Calibri" w:hAnsi="Calibri" w:cs="Calibri"/>
+                <w:sz w:val="20"/>
+              </w:rPr>
+              <w:t xml:space="preserve">Off by default; on per message by explicit request</w:t>
+            </w:r>
+          </w:p>
+        </w:tc>
+        <w:tc>
+          <w:tcPr>
+            <w:tcW w:w="2520" w:type="dxa"/>
+          </w:tcPr>
+          <w:p>
+            <w:pPr>
+              <w:spacing w:before="0" w:after="0"/>
+            </w:pPr>
+            <w:r>
+              <w:rPr>
+                <w:rFonts w:ascii="Calibri" w:hAnsi="Calibri" w:cs="Calibri"/>
+                <w:sz w:val="20"/>
+              </w:rPr>
+              <w:t xml:space="preserve">Fastest generation, which is what chat latency depends on. Conversation memory does not exist yet (/agent is single-turn) and needs its own ADR.</w:t>
+            </w:r>
+          </w:p>
+        </w:tc>
+      </w:tr>
+      <w:tr>
+        <w:tc>
+          <w:tcPr>
+            <w:tcW w:w="2520" w:type="dxa"/>
+          </w:tcPr>
+          <w:p>
+            <w:pPr>
+              <w:spacing w:before="0" w:after="0"/>
+            </w:pPr>
+            <w:r>
+              <w:rPr>
+                <w:rFonts w:ascii="Calibri" w:hAnsi="Calibri" w:cs="Calibri"/>
+                <w:sz w:val="20"/>
+              </w:rPr>
+              <w:t xml:space="preserve">Hard one-off questions (reasoning, comparison, planning)</w:t>
+            </w:r>
+          </w:p>
+        </w:tc>
+        <w:tc>
+          <w:tcPr>
+            <w:tcW w:w="2520" w:type="dxa"/>
+          </w:tcPr>
+          <w:p>
+            <w:pPr>
+              <w:spacing w:before="0" w:after="0"/>
+            </w:pPr>
+            <w:r>
+              <w:rPr>
+                <w:rFonts w:ascii="Calibri" w:hAnsi="Calibri" w:cs="Calibri"/>
+                <w:sz w:val="20"/>
+              </w:rPr>
+              <w:t xml:space="preserve">Either</w:t>
+            </w:r>
+          </w:p>
+        </w:tc>
+        <w:tc>
+          <w:tcPr>
+            <w:tcW w:w="2520" w:type="dxa"/>
+          </w:tcPr>
+          <w:p>
+            <w:pPr>
+              <w:spacing w:before="0" w:after="0"/>
+            </w:pPr>
+            <w:r>
+              <w:rPr>
+                <w:rFonts w:ascii="Calibri" w:hAnsi="Calibri" w:cs="Calibri"/>
+                <w:sz w:val="20"/>
+              </w:rPr>
+              <w:t xml:space="preserve">On</w:t>
+            </w:r>
+          </w:p>
+        </w:tc>
+        <w:tc>
+          <w:tcPr>
+            <w:tcW w:w="2520" w:type="dxa"/>
+          </w:tcPr>
+          <w:p>
+            <w:pPr>
+              <w:spacing w:before="0" w:after="0"/>
+            </w:pPr>
+            <w:r>
+              <w:rPr>
+                <w:rFonts w:ascii="Calibri" w:hAnsi="Calibri" w:cs="Calibri"/>
+                <w:sz w:val="20"/>
+              </w:rPr>
+              <w:t xml:space="preserve">Operator's explicit choice per request</w:t>
+            </w:r>
+          </w:p>
+        </w:tc>
+      </w:tr>
+    </w:tbl>
+    <w:p/>
+    <w:p>
+      <w:pPr>
+        <w:spacing w:before="0" w:after="100"/>
+      </w:pPr>
+      <w:r>
+        <w:rPr>
+          <w:rFonts w:ascii="Calibri" w:hAnsi="Calibri" w:cs="Calibri"/>
+          <w:sz w:val="21"/>
+        </w:rPr>
+        <w:t xml:space="preserve">Thinking output is useful for debugging but is not a faithful account of how the model reached its answer, and is not to be treated as an audit trail. Disk: gemma4:e4b 9.6 GB + qwen3:8b 5.2 GB.</w:t>
+      </w:r>
+    </w:p>
+    <w:p>
+      <w:pPr>
         <w:spacing w:before="0" w:after="100"/>
       </w:pPr>
       <w:r>
@@ -4343,7 +5397,7 @@
           <w:color w:val="555555"/>
           <w:sz w:val="19"/>
         </w:rPr>
-        <w:t xml:space="preserve">Sheldon Wheeler — OpenClaw Personal Stack — ADR-047 — Decided September 29, 2026</w:t>
+        <w:t xml:space="preserve">Sheldon Wheeler — OpenClaw Personal Stack — ADR-047 — Decided September 29, 2026; amended September 29, 2026 (§8, §14)</w:t>
       </w:r>
     </w:p>
     <w:sectPr>

</xml_diff>

<commit_message>
Entry #049: briefs back to gemma4:e4b (generator v9.4, ADR-047 §14 note); v9.5 FR links in source list; ADR-047 step 6 — nightly agent_actions partition maintenance (F10) with tests, live run dropped 2026-04..06; finding F16; handoff updated
Co-Authored-By: Claude Opus 5.5 <noreply@anthropic.com>
</commit_message>
<xml_diff>
--- a/ADR_047.docx
+++ b/ADR_047.docx
@@ -5394,10 +5394,30 @@
       <w:r>
         <w:rPr>
           <w:rFonts w:ascii="Calibri" w:hAnsi="Calibri" w:cs="Calibri"/>
+          <w:b/>
+          <w:sz w:val="21"/>
+        </w:rPr>
+        <w:t xml:space="preserve">Amendment note — brief model reversed (operator, September 30, 2026).</w:t>
+      </w:r>
+      <w:r>
+        <w:rPr>
+          <w:rFonts w:ascii="Calibri" w:hAnsi="Calibri" w:cs="Calibri"/>
+          <w:sz w:val="21"/>
+        </w:rPr>
+        <w:t xml:space="preserve"> The policy-brief workload moves from qwen3:8b to gemma4:e4b, thinking off; chat is unchanged, so one model now serves both. Basis: reading the round-3 briefs of the two finalists against SYSTEM_PROMPT. qwen3:8b recommended action to state agencies, editorialised ("signal ongoing interest in state innovation"), asserted significance for a rule with no abstract, tallied inputs, and described child support enforcement as "a key function under TANF". Its facts checked out against the source abstracts; its departures from the prompt are exactly what the verifier cannot detect, which is why the two models tied on the scored metrics. gemma4:e4b stayed inside the sources. Accepted cost: higher memory use (~5.8 GB vs ~3.4 GB median drop), offset by faster runs (154 s vs 224 s) and the pre-flight memory gate. Basis is one brief per model. Implemented as generator v9.4 (Entry #049); qwen3:8b stays installed until gemma4:e4b completes a clean --send. The table above records the September 29 assignment.</w:t>
+      </w:r>
+    </w:p>
+    <w:p>
+      <w:pPr>
+        <w:spacing w:before="0" w:after="100"/>
+      </w:pPr>
+      <w:r>
+        <w:rPr>
+          <w:rFonts w:ascii="Calibri" w:hAnsi="Calibri" w:cs="Calibri"/>
           <w:color w:val="555555"/>
           <w:sz w:val="19"/>
         </w:rPr>
-        <w:t xml:space="preserve">Sheldon Wheeler — OpenClaw Personal Stack — ADR-047 — Decided September 29, 2026; amended September 29, 2026 (§8, §14)</w:t>
+        <w:t xml:space="preserve">Sheldon Wheeler — OpenClaw Personal Stack — ADR-047 — Decided September 29, 2026; amended September 29, 2026 (§8, §14); §14 note September 30, 2026</w:t>
       </w:r>
     </w:p>
     <w:sectPr>

</xml_diff>